<commit_message>
fix(writer): a picture fits the line its paragraph leaves it
A picture was fitted to the text width and then indented, so with
--indent, in a list or in a quotation it ran past the right margin by
the indent.

A picture alone in its paragraph now takes no first-line indent. One
that opens a paragraph, or sits in a list or a quotation, is drawn no
wider than its line.

Goldens: thesis-options and thesis-auto change in word/document.xml
only, where the four picture paragraphs lose w:firstLine="720". The
other four are unchanged.

Signed-off-by: Sayam Sriphua <976721+sayam@users.noreply.github.com>
</commit_message>
<xml_diff>
--- a/tests/golden/thesis-auto.docx
+++ b/tests/golden/thesis-auto.docx
@@ -2556,7 +2556,6 @@
     <w:p>
       <w:pPr>
         <w:keepNext/>
-        <w:ind w:firstLine="720"/>
       </w:pPr>
       <w:r>
         <w:drawing>
@@ -2910,7 +2909,6 @@
     <w:p>
       <w:pPr>
         <w:keepNext/>
-        <w:ind w:firstLine="720"/>
       </w:pPr>
       <w:r>
         <w:drawing>
@@ -6558,7 +6556,6 @@
     <w:p>
       <w:pPr>
         <w:keepNext/>
-        <w:ind w:firstLine="720"/>
       </w:pPr>
       <w:r>
         <w:drawing>
@@ -7886,7 +7883,6 @@
     <w:p>
       <w:pPr>
         <w:keepNext/>
-        <w:ind w:firstLine="720"/>
       </w:pPr>
       <w:r>
         <w:drawing>

</xml_diff>

<commit_message>
test(oracle): the thesis profile is opened, on narrow pictures
The review of 0.3.0, A-03 and D-01: no golden passed --profile thesis,
--caption-matches-object or --center-images, and every thesis picture
was wider than the text, so the boxed caption was never opened. The
variant sample-thesis builds thesis.md with the flags thesis.json
stands for, golden thesis-profile. Two synthetic pictures, 2.5 in and
4.17 in wide, take the place of the second use of chart.png and
flow.png, so one caption box is wider than its picture and one is as
wide. The four thesis goldens move: the two pictures, nothing else.

Signed-off-by: Sayam Sriphua <976721+sayam@users.noreply.github.com>
</commit_message>
<xml_diff>
--- a/tests/golden/thesis-auto.docx
+++ b/tests/golden/thesis-auto.docx
@@ -79,8 +79,8 @@
       <w:pPr>
         <w:ind w:firstLine="720"/>
         <w:sectPr>
-          <w:headerReference w:type="default" r:id="rId8"/>
-          <w:footerReference w:type="default" r:id="rId10"/>
+          <w:headerReference w:type="default" r:id="rId10"/>
+          <w:footerReference w:type="default" r:id="rId12"/>
           <w:footnotePr>
             <w:numFmt w:val="thaiNumbers"/>
           </w:footnotePr>
@@ -218,10 +218,10 @@
       <w:pPr>
         <w:ind w:firstLine="720"/>
         <w:sectPr>
-          <w:headerReference w:type="default" r:id="rId7"/>
-          <w:headerReference w:type="first" r:id="rId8"/>
-          <w:footerReference w:type="default" r:id="rId9"/>
-          <w:footerReference w:type="first" r:id="rId10"/>
+          <w:headerReference w:type="default" r:id="rId9"/>
+          <w:headerReference w:type="first" r:id="rId10"/>
+          <w:footerReference w:type="default" r:id="rId11"/>
+          <w:footerReference w:type="first" r:id="rId12"/>
           <w:footnotePr>
             <w:numFmt w:val="thaiNumbers"/>
           </w:footnotePr>
@@ -288,10 +288,10 @@
         <w:ind w:firstLine="720"/>
         <w:jc w:val="left"/>
         <w:sectPr>
-          <w:headerReference w:type="default" r:id="rId7"/>
-          <w:headerReference w:type="first" r:id="rId8"/>
-          <w:footerReference w:type="default" r:id="rId9"/>
-          <w:footerReference w:type="first" r:id="rId10"/>
+          <w:headerReference w:type="default" r:id="rId9"/>
+          <w:headerReference w:type="first" r:id="rId10"/>
+          <w:footerReference w:type="default" r:id="rId11"/>
+          <w:footerReference w:type="first" r:id="rId12"/>
           <w:footnotePr>
             <w:numFmt w:val="thaiNumbers"/>
           </w:footnotePr>
@@ -352,10 +352,10 @@
       <w:pPr>
         <w:ind w:firstLine="720"/>
         <w:sectPr>
-          <w:headerReference w:type="default" r:id="rId7"/>
-          <w:headerReference w:type="first" r:id="rId8"/>
-          <w:footerReference w:type="default" r:id="rId9"/>
-          <w:footerReference w:type="first" r:id="rId10"/>
+          <w:headerReference w:type="default" r:id="rId9"/>
+          <w:headerReference w:type="first" r:id="rId10"/>
+          <w:footerReference w:type="default" r:id="rId11"/>
+          <w:footerReference w:type="first" r:id="rId12"/>
           <w:footnotePr>
             <w:numFmt w:val="thaiNumbers"/>
           </w:footnotePr>
@@ -807,10 +807,10 @@
     <w:p>
       <w:pPr>
         <w:sectPr>
-          <w:headerReference w:type="default" r:id="rId7"/>
-          <w:headerReference w:type="first" r:id="rId8"/>
-          <w:footerReference w:type="default" r:id="rId9"/>
-          <w:footerReference w:type="first" r:id="rId10"/>
+          <w:headerReference w:type="default" r:id="rId9"/>
+          <w:headerReference w:type="first" r:id="rId10"/>
+          <w:footerReference w:type="default" r:id="rId11"/>
+          <w:footerReference w:type="first" r:id="rId12"/>
           <w:footnotePr>
             <w:numFmt w:val="thaiNumbers"/>
           </w:footnotePr>
@@ -926,10 +926,10 @@
     <w:p>
       <w:pPr>
         <w:sectPr>
-          <w:headerReference w:type="default" r:id="rId7"/>
-          <w:headerReference w:type="first" r:id="rId8"/>
-          <w:footerReference w:type="default" r:id="rId9"/>
-          <w:footerReference w:type="first" r:id="rId10"/>
+          <w:headerReference w:type="default" r:id="rId9"/>
+          <w:headerReference w:type="first" r:id="rId10"/>
+          <w:footerReference w:type="default" r:id="rId11"/>
+          <w:footerReference w:type="first" r:id="rId12"/>
           <w:footnotePr>
             <w:numFmt w:val="thaiNumbers"/>
           </w:footnotePr>
@@ -1022,10 +1022,10 @@
     <w:p>
       <w:pPr>
         <w:sectPr>
-          <w:headerReference w:type="default" r:id="rId7"/>
-          <w:headerReference w:type="first" r:id="rId8"/>
-          <w:footerReference w:type="default" r:id="rId9"/>
-          <w:footerReference w:type="first" r:id="rId10"/>
+          <w:headerReference w:type="default" r:id="rId9"/>
+          <w:headerReference w:type="first" r:id="rId10"/>
+          <w:footerReference w:type="default" r:id="rId11"/>
+          <w:footerReference w:type="first" r:id="rId12"/>
           <w:footnotePr>
             <w:numFmt w:val="thaiNumbers"/>
           </w:footnotePr>
@@ -2039,10 +2039,10 @@
     <w:p>
       <w:pPr>
         <w:sectPr>
-          <w:headerReference w:type="default" r:id="rId7"/>
-          <w:headerReference w:type="first" r:id="rId8"/>
-          <w:footerReference w:type="default" r:id="rId9"/>
-          <w:footerReference w:type="first" r:id="rId10"/>
+          <w:headerReference w:type="default" r:id="rId9"/>
+          <w:headerReference w:type="first" r:id="rId10"/>
+          <w:footerReference w:type="default" r:id="rId11"/>
+          <w:footerReference w:type="first" r:id="rId12"/>
           <w:footnotePr>
             <w:numFmt w:val="thaiNumbers"/>
           </w:footnotePr>
@@ -2836,10 +2836,10 @@
       <w:pPr>
         <w:ind w:firstLine="720"/>
         <w:sectPr>
-          <w:headerReference w:type="default" r:id="rId7"/>
-          <w:headerReference w:type="first" r:id="rId8"/>
-          <w:footerReference w:type="default" r:id="rId9"/>
-          <w:footerReference w:type="first" r:id="rId10"/>
+          <w:headerReference w:type="default" r:id="rId9"/>
+          <w:headerReference w:type="first" r:id="rId10"/>
+          <w:footerReference w:type="default" r:id="rId11"/>
+          <w:footerReference w:type="first" r:id="rId12"/>
           <w:footnotePr>
             <w:numFmt w:val="thaiNumbers"/>
           </w:footnotePr>
@@ -3127,10 +3127,10 @@
           <w:numId w:val="3"/>
         </w:numPr>
         <w:sectPr>
-          <w:headerReference w:type="default" r:id="rId7"/>
-          <w:headerReference w:type="first" r:id="rId8"/>
-          <w:footerReference w:type="default" r:id="rId9"/>
-          <w:footerReference w:type="first" r:id="rId10"/>
+          <w:headerReference w:type="default" r:id="rId9"/>
+          <w:headerReference w:type="first" r:id="rId10"/>
+          <w:footerReference w:type="default" r:id="rId11"/>
+          <w:footerReference w:type="first" r:id="rId12"/>
           <w:footnotePr>
             <w:numFmt w:val="thaiNumbers"/>
           </w:footnotePr>
@@ -6586,7 +6586,7 @@
       <w:r>
         <w:drawing>
           <wp:inline distT="0" distB="0" distL="0" distR="0">
-            <wp:extent cx="5274310" cy="2812965"/>
+            <wp:extent cx="2286000" cy="1524000"/>
             <wp:docPr id="3" name="Picture 3" descr="แผนภูมิแท่งสรุปผล"/>
             <a:graphic>
               <a:graphicData uri="http://schemas.openxmlformats.org/drawingml/2006/picture">
@@ -6596,7 +6596,7 @@
                     <pic:cNvPicPr/>
                   </pic:nvPicPr>
                   <pic:blipFill>
-                    <a:blip r:embed="rId3"/>
+                    <a:blip r:embed="rId5"/>
                     <a:stretch>
                       <a:fillRect/>
                     </a:stretch>
@@ -6604,7 +6604,7 @@
                   <pic:spPr>
                     <a:xfrm>
                       <a:off x="0" y="0"/>
-                      <a:ext cx="5274310" cy="2812965"/>
+                      <a:ext cx="2286000" cy="1524000"/>
                     </a:xfrm>
                     <a:prstGeom prst="rect">
                       <a:avLst/>
@@ -6719,10 +6719,10 @@
     <w:p>
       <w:pPr>
         <w:sectPr>
-          <w:headerReference w:type="default" r:id="rId7"/>
-          <w:headerReference w:type="first" r:id="rId8"/>
-          <w:footerReference w:type="default" r:id="rId9"/>
-          <w:footerReference w:type="first" r:id="rId10"/>
+          <w:headerReference w:type="default" r:id="rId9"/>
+          <w:headerReference w:type="first" r:id="rId10"/>
+          <w:footerReference w:type="default" r:id="rId11"/>
+          <w:footerReference w:type="first" r:id="rId12"/>
           <w:footnotePr>
             <w:numFmt w:val="thaiNumbers"/>
           </w:footnotePr>
@@ -6843,10 +6843,10 @@
           <w:bottom w:val="single" w:sz="6" w:space="1" w:color="808080"/>
         </w:pBdr>
         <w:sectPr>
-          <w:headerReference w:type="default" r:id="rId7"/>
-          <w:headerReference w:type="first" r:id="rId8"/>
-          <w:footerReference w:type="default" r:id="rId9"/>
-          <w:footerReference w:type="first" r:id="rId10"/>
+          <w:headerReference w:type="default" r:id="rId9"/>
+          <w:headerReference w:type="first" r:id="rId10"/>
+          <w:footerReference w:type="default" r:id="rId11"/>
+          <w:footerReference w:type="first" r:id="rId12"/>
           <w:footnotePr>
             <w:numFmt w:val="thaiNumbers"/>
           </w:footnotePr>
@@ -6889,7 +6889,7 @@
       <w:r>
         <w:t xml:space="preserve"> (5th ed.). </w:t>
       </w:r>
-      <w:hyperlink r:id="rId5" w:history="1">
+      <w:hyperlink r:id="rId6" w:history="1">
         <w:r>
           <w:rPr>
             <w:rStyle w:val="Hyperlink"/>
@@ -6916,7 +6916,7 @@
       <w:r>
         <w:t xml:space="preserve"> (Version 0.31.2). </w:t>
       </w:r>
-      <w:hyperlink r:id="rId6" w:history="1">
+      <w:hyperlink r:id="rId7" w:history="1">
         <w:r>
           <w:rPr>
             <w:rStyle w:val="Hyperlink"/>
@@ -6929,10 +6929,10 @@
       <w:pPr>
         <w:ind w:firstLine="720"/>
         <w:sectPr>
-          <w:headerReference w:type="default" r:id="rId7"/>
-          <w:headerReference w:type="first" r:id="rId8"/>
-          <w:footerReference w:type="default" r:id="rId9"/>
-          <w:footerReference w:type="first" r:id="rId10"/>
+          <w:headerReference w:type="default" r:id="rId9"/>
+          <w:headerReference w:type="first" r:id="rId10"/>
+          <w:footerReference w:type="default" r:id="rId11"/>
+          <w:footerReference w:type="first" r:id="rId12"/>
           <w:footnotePr>
             <w:numFmt w:val="thaiNumbers"/>
           </w:footnotePr>
@@ -7388,10 +7388,10 @@
       <w:pPr>
         <w:ind w:firstLine="720"/>
         <w:sectPr>
-          <w:headerReference w:type="default" r:id="rId7"/>
-          <w:headerReference w:type="first" r:id="rId8"/>
-          <w:footerReference w:type="default" r:id="rId9"/>
-          <w:footerReference w:type="first" r:id="rId10"/>
+          <w:headerReference w:type="default" r:id="rId9"/>
+          <w:headerReference w:type="first" r:id="rId10"/>
+          <w:footerReference w:type="default" r:id="rId11"/>
+          <w:footerReference w:type="first" r:id="rId12"/>
           <w:footnotePr>
             <w:numFmt w:val="thaiNumbers"/>
           </w:footnotePr>
@@ -7913,7 +7913,7 @@
       <w:r>
         <w:drawing>
           <wp:inline distT="0" distB="0" distL="0" distR="0">
-            <wp:extent cx="5274310" cy="2285534"/>
+            <wp:extent cx="3810000" cy="1905000"/>
             <wp:docPr id="4" name="Picture 4" descr="แผนภาพขั้นตอนการตรวจสอบ"/>
             <a:graphic>
               <a:graphicData uri="http://schemas.openxmlformats.org/drawingml/2006/picture">
@@ -7923,7 +7923,7 @@
                     <pic:cNvPicPr/>
                   </pic:nvPicPr>
                   <pic:blipFill>
-                    <a:blip r:embed="rId4"/>
+                    <a:blip r:embed="rId8"/>
                     <a:stretch>
                       <a:fillRect/>
                     </a:stretch>
@@ -7931,7 +7931,7 @@
                   <pic:spPr>
                     <a:xfrm>
                       <a:off x="0" y="0"/>
-                      <a:ext cx="5274310" cy="2285534"/>
+                      <a:ext cx="3810000" cy="1905000"/>
                     </a:xfrm>
                     <a:prstGeom prst="rect">
                       <a:avLst/>
@@ -8045,10 +8045,10 @@
     <w:p>
       <w:pPr>
         <w:sectPr>
-          <w:headerReference w:type="default" r:id="rId7"/>
-          <w:headerReference w:type="first" r:id="rId8"/>
-          <w:footerReference w:type="default" r:id="rId9"/>
-          <w:footerReference w:type="first" r:id="rId10"/>
+          <w:headerReference w:type="default" r:id="rId9"/>
+          <w:headerReference w:type="first" r:id="rId10"/>
+          <w:footerReference w:type="default" r:id="rId11"/>
+          <w:footerReference w:type="first" r:id="rId12"/>
           <w:footnotePr>
             <w:numFmt w:val="thaiNumbers"/>
           </w:footnotePr>
@@ -8159,10 +8159,10 @@
       <w:pPr>
         <w:pStyle w:val="CodeBlock"/>
         <w:sectPr>
-          <w:headerReference w:type="default" r:id="rId7"/>
-          <w:headerReference w:type="first" r:id="rId8"/>
-          <w:footerReference w:type="default" r:id="rId9"/>
-          <w:footerReference w:type="first" r:id="rId10"/>
+          <w:headerReference w:type="default" r:id="rId9"/>
+          <w:headerReference w:type="first" r:id="rId10"/>
+          <w:footerReference w:type="default" r:id="rId11"/>
+          <w:footerReference w:type="first" r:id="rId12"/>
           <w:footnotePr>
             <w:numFmt w:val="thaiNumbers"/>
           </w:footnotePr>
@@ -8241,10 +8241,10 @@
       </w:r>
     </w:p>
     <w:sectPr>
-      <w:headerReference w:type="default" r:id="rId7"/>
-      <w:headerReference w:type="first" r:id="rId8"/>
-      <w:footerReference w:type="default" r:id="rId9"/>
-      <w:footerReference w:type="first" r:id="rId10"/>
+      <w:headerReference w:type="default" r:id="rId9"/>
+      <w:headerReference w:type="first" r:id="rId10"/>
+      <w:footerReference w:type="default" r:id="rId11"/>
+      <w:footerReference w:type="first" r:id="rId12"/>
       <w:footnotePr>
         <w:numFmt w:val="thaiNumbers"/>
       </w:footnotePr>

</xml_diff>

<commit_message>
fix(writer): Thai distributed is for the body, never inside a box
Word 365 for Windows spread the letters of a narrow table cell across
the cell under the thesis profile. The maintainer's decision: --align
thai applies to the paragraphs of the body alone. A table cell and a
caption boxed to its picture are justified at the spaces between words
(w:jc both); a column marked left, centred or right keeps its mark;
without --align thai nothing is written. ADR 0027 gains a Later line,
limits.md §5 says what the alignment does to a short line and that a
table the reader inserts in Word still takes it, and the settings table
and both guides say body paragraphs only. Ledger row RD-02.

The goldens built with --align thai move (sample-all-flags,
thesis-options, thesis-auto, thesis-profile): a w:jc on those
paragraphs, nothing else.

Signed-off-by: Sayam Sriphua <976721+sayam@users.noreply.github.com>
</commit_message>
<xml_diff>
--- a/tests/golden/thesis-auto.docx
+++ b/tests/golden/thesis-auto.docx
@@ -1813,6 +1813,7 @@
             <w:pPr>
               <w:pStyle w:val="TableText"/>
               <w:spacing w:after="0"/>
+              <w:jc w:val="left"/>
             </w:pPr>
             <w:r>
               <w:rPr>
@@ -1832,6 +1833,7 @@
             <w:pPr>
               <w:pStyle w:val="TableText"/>
               <w:spacing w:after="0"/>
+              <w:jc w:val="left"/>
             </w:pPr>
             <w:r>
               <w:rPr>
@@ -1873,6 +1875,7 @@
             <w:pPr>
               <w:pStyle w:val="TableText"/>
               <w:spacing w:after="0"/>
+              <w:jc w:val="left"/>
             </w:pPr>
             <w:r>
               <w:rPr>
@@ -1890,6 +1893,7 @@
             <w:pPr>
               <w:pStyle w:val="TableText"/>
               <w:spacing w:after="0"/>
+              <w:jc w:val="left"/>
             </w:pPr>
             <w:r>
               <w:rPr>
@@ -1927,6 +1931,7 @@
             <w:pPr>
               <w:pStyle w:val="TableText"/>
               <w:spacing w:after="0"/>
+              <w:jc w:val="left"/>
             </w:pPr>
             <w:r>
               <w:rPr>
@@ -1944,6 +1949,7 @@
             <w:pPr>
               <w:pStyle w:val="TableText"/>
               <w:spacing w:after="0"/>
+              <w:jc w:val="left"/>
             </w:pPr>
             <w:r>
               <w:rPr>
@@ -1981,6 +1987,7 @@
             <w:pPr>
               <w:pStyle w:val="TableText"/>
               <w:spacing w:after="0"/>
+              <w:jc w:val="left"/>
             </w:pPr>
             <w:r>
               <w:rPr>
@@ -1998,6 +2005,7 @@
             <w:pPr>
               <w:pStyle w:val="TableText"/>
               <w:spacing w:after="0"/>
+              <w:jc w:val="left"/>
             </w:pPr>
             <w:r>
               <w:rPr>
@@ -2272,6 +2280,7 @@
             <w:pPr>
               <w:pStyle w:val="TableText"/>
               <w:spacing w:after="0"/>
+              <w:jc w:val="left"/>
             </w:pPr>
             <w:r>
               <w:rPr>
@@ -2340,6 +2349,7 @@
             <w:pPr>
               <w:pStyle w:val="TableText"/>
               <w:spacing w:after="0"/>
+              <w:jc w:val="left"/>
             </w:pPr>
             <w:r>
               <w:rPr>
@@ -2397,6 +2407,7 @@
             <w:pPr>
               <w:pStyle w:val="TableText"/>
               <w:spacing w:after="0"/>
+              <w:jc w:val="left"/>
             </w:pPr>
             <w:r>
               <w:rPr>
@@ -2454,6 +2465,7 @@
             <w:pPr>
               <w:pStyle w:val="TableText"/>
               <w:spacing w:after="0"/>
+              <w:jc w:val="left"/>
             </w:pPr>
             <w:r>
               <w:rPr>
@@ -2511,6 +2523,7 @@
             <w:pPr>
               <w:pStyle w:val="TableText"/>
               <w:spacing w:after="0"/>
+              <w:jc w:val="left"/>
             </w:pPr>
             <w:r>
               <w:rPr>
@@ -3343,6 +3356,7 @@
             <w:pPr>
               <w:pStyle w:val="TableText"/>
               <w:spacing w:after="0"/>
+              <w:jc w:val="left"/>
             </w:pPr>
             <w:r>
               <w:rPr>
@@ -3439,6 +3453,7 @@
             <w:pPr>
               <w:pStyle w:val="TableText"/>
               <w:spacing w:after="0"/>
+              <w:jc w:val="left"/>
             </w:pPr>
             <w:r>
               <w:rPr>
@@ -3518,6 +3533,7 @@
             <w:pPr>
               <w:pStyle w:val="TableText"/>
               <w:spacing w:after="0"/>
+              <w:jc w:val="left"/>
             </w:pPr>
             <w:r>
               <w:rPr>
@@ -3597,6 +3613,7 @@
             <w:pPr>
               <w:pStyle w:val="TableText"/>
               <w:spacing w:after="0"/>
+              <w:jc w:val="left"/>
             </w:pPr>
             <w:r>
               <w:rPr>
@@ -3676,6 +3693,7 @@
             <w:pPr>
               <w:pStyle w:val="TableText"/>
               <w:spacing w:after="0"/>
+              <w:jc w:val="left"/>
             </w:pPr>
             <w:r>
               <w:rPr>
@@ -3755,6 +3773,7 @@
             <w:pPr>
               <w:pStyle w:val="TableText"/>
               <w:spacing w:after="0"/>
+              <w:jc w:val="left"/>
             </w:pPr>
             <w:r>
               <w:rPr>
@@ -3834,6 +3853,7 @@
             <w:pPr>
               <w:pStyle w:val="TableText"/>
               <w:spacing w:after="0"/>
+              <w:jc w:val="left"/>
             </w:pPr>
             <w:r>
               <w:rPr>
@@ -3913,6 +3933,7 @@
             <w:pPr>
               <w:pStyle w:val="TableText"/>
               <w:spacing w:after="0"/>
+              <w:jc w:val="left"/>
             </w:pPr>
             <w:r>
               <w:rPr>
@@ -3992,6 +4013,7 @@
             <w:pPr>
               <w:pStyle w:val="TableText"/>
               <w:spacing w:after="0"/>
+              <w:jc w:val="left"/>
             </w:pPr>
             <w:r>
               <w:rPr>
@@ -4071,6 +4093,7 @@
             <w:pPr>
               <w:pStyle w:val="TableText"/>
               <w:spacing w:after="0"/>
+              <w:jc w:val="left"/>
             </w:pPr>
             <w:r>
               <w:rPr>
@@ -4150,6 +4173,7 @@
             <w:pPr>
               <w:pStyle w:val="TableText"/>
               <w:spacing w:after="0"/>
+              <w:jc w:val="left"/>
             </w:pPr>
             <w:r>
               <w:rPr>
@@ -4229,6 +4253,7 @@
             <w:pPr>
               <w:pStyle w:val="TableText"/>
               <w:spacing w:after="0"/>
+              <w:jc w:val="left"/>
             </w:pPr>
             <w:r>
               <w:rPr>
@@ -4308,6 +4333,7 @@
             <w:pPr>
               <w:pStyle w:val="TableText"/>
               <w:spacing w:after="0"/>
+              <w:jc w:val="left"/>
             </w:pPr>
             <w:r>
               <w:rPr>
@@ -4387,6 +4413,7 @@
             <w:pPr>
               <w:pStyle w:val="TableText"/>
               <w:spacing w:after="0"/>
+              <w:jc w:val="left"/>
             </w:pPr>
             <w:r>
               <w:rPr>
@@ -4466,6 +4493,7 @@
             <w:pPr>
               <w:pStyle w:val="TableText"/>
               <w:spacing w:after="0"/>
+              <w:jc w:val="left"/>
             </w:pPr>
             <w:r>
               <w:rPr>
@@ -4545,6 +4573,7 @@
             <w:pPr>
               <w:pStyle w:val="TableText"/>
               <w:spacing w:after="0"/>
+              <w:jc w:val="left"/>
             </w:pPr>
             <w:r>
               <w:rPr>
@@ -4624,6 +4653,7 @@
             <w:pPr>
               <w:pStyle w:val="TableText"/>
               <w:spacing w:after="0"/>
+              <w:jc w:val="left"/>
             </w:pPr>
             <w:r>
               <w:rPr>
@@ -4703,6 +4733,7 @@
             <w:pPr>
               <w:pStyle w:val="TableText"/>
               <w:spacing w:after="0"/>
+              <w:jc w:val="left"/>
             </w:pPr>
             <w:r>
               <w:rPr>
@@ -4782,6 +4813,7 @@
             <w:pPr>
               <w:pStyle w:val="TableText"/>
               <w:spacing w:after="0"/>
+              <w:jc w:val="left"/>
             </w:pPr>
             <w:r>
               <w:rPr>
@@ -4861,6 +4893,7 @@
             <w:pPr>
               <w:pStyle w:val="TableText"/>
               <w:spacing w:after="0"/>
+              <w:jc w:val="left"/>
             </w:pPr>
             <w:r>
               <w:rPr>
@@ -4940,6 +4973,7 @@
             <w:pPr>
               <w:pStyle w:val="TableText"/>
               <w:spacing w:after="0"/>
+              <w:jc w:val="left"/>
             </w:pPr>
             <w:r>
               <w:rPr>
@@ -5019,6 +5053,7 @@
             <w:pPr>
               <w:pStyle w:val="TableText"/>
               <w:spacing w:after="0"/>
+              <w:jc w:val="left"/>
             </w:pPr>
             <w:r>
               <w:rPr>
@@ -5098,6 +5133,7 @@
             <w:pPr>
               <w:pStyle w:val="TableText"/>
               <w:spacing w:after="0"/>
+              <w:jc w:val="left"/>
             </w:pPr>
             <w:r>
               <w:rPr>
@@ -5177,6 +5213,7 @@
             <w:pPr>
               <w:pStyle w:val="TableText"/>
               <w:spacing w:after="0"/>
+              <w:jc w:val="left"/>
             </w:pPr>
             <w:r>
               <w:rPr>
@@ -5256,6 +5293,7 @@
             <w:pPr>
               <w:pStyle w:val="TableText"/>
               <w:spacing w:after="0"/>
+              <w:jc w:val="left"/>
             </w:pPr>
             <w:r>
               <w:rPr>
@@ -5335,6 +5373,7 @@
             <w:pPr>
               <w:pStyle w:val="TableText"/>
               <w:spacing w:after="0"/>
+              <w:jc w:val="left"/>
             </w:pPr>
             <w:r>
               <w:rPr>
@@ -5414,6 +5453,7 @@
             <w:pPr>
               <w:pStyle w:val="TableText"/>
               <w:spacing w:after="0"/>
+              <w:jc w:val="left"/>
             </w:pPr>
             <w:r>
               <w:rPr>
@@ -5493,6 +5533,7 @@
             <w:pPr>
               <w:pStyle w:val="TableText"/>
               <w:spacing w:after="0"/>
+              <w:jc w:val="left"/>
             </w:pPr>
             <w:r>
               <w:rPr>
@@ -5572,6 +5613,7 @@
             <w:pPr>
               <w:pStyle w:val="TableText"/>
               <w:spacing w:after="0"/>
+              <w:jc w:val="left"/>
             </w:pPr>
             <w:r>
               <w:rPr>
@@ -5651,6 +5693,7 @@
             <w:pPr>
               <w:pStyle w:val="TableText"/>
               <w:spacing w:after="0"/>
+              <w:jc w:val="left"/>
             </w:pPr>
             <w:r>
               <w:rPr>
@@ -5730,6 +5773,7 @@
             <w:pPr>
               <w:pStyle w:val="TableText"/>
               <w:spacing w:after="0"/>
+              <w:jc w:val="left"/>
             </w:pPr>
             <w:r>
               <w:rPr>
@@ -5809,6 +5853,7 @@
             <w:pPr>
               <w:pStyle w:val="TableText"/>
               <w:spacing w:after="0"/>
+              <w:jc w:val="left"/>
             </w:pPr>
             <w:r>
               <w:rPr>
@@ -5888,6 +5933,7 @@
             <w:pPr>
               <w:pStyle w:val="TableText"/>
               <w:spacing w:after="0"/>
+              <w:jc w:val="left"/>
             </w:pPr>
             <w:r>
               <w:rPr>
@@ -5967,6 +6013,7 @@
             <w:pPr>
               <w:pStyle w:val="TableText"/>
               <w:spacing w:after="0"/>
+              <w:jc w:val="left"/>
             </w:pPr>
             <w:r>
               <w:rPr>
@@ -6046,6 +6093,7 @@
             <w:pPr>
               <w:pStyle w:val="TableText"/>
               <w:spacing w:after="0"/>
+              <w:jc w:val="left"/>
             </w:pPr>
             <w:r>
               <w:rPr>
@@ -6125,6 +6173,7 @@
             <w:pPr>
               <w:pStyle w:val="TableText"/>
               <w:spacing w:after="0"/>
+              <w:jc w:val="left"/>
             </w:pPr>
             <w:r>
               <w:rPr>
@@ -6204,6 +6253,7 @@
             <w:pPr>
               <w:pStyle w:val="TableText"/>
               <w:spacing w:after="0"/>
+              <w:jc w:val="left"/>
             </w:pPr>
             <w:r>
               <w:rPr>
@@ -6283,6 +6333,7 @@
             <w:pPr>
               <w:pStyle w:val="TableText"/>
               <w:spacing w:after="0"/>
+              <w:jc w:val="left"/>
             </w:pPr>
             <w:r>
               <w:rPr>
@@ -6362,6 +6413,7 @@
             <w:pPr>
               <w:pStyle w:val="TableText"/>
               <w:spacing w:after="0"/>
+              <w:jc w:val="left"/>
             </w:pPr>
             <w:r>
               <w:rPr>
@@ -6441,6 +6493,7 @@
             <w:pPr>
               <w:pStyle w:val="TableText"/>
               <w:spacing w:after="0"/>
+              <w:jc w:val="left"/>
             </w:pPr>
             <w:r>
               <w:rPr>
@@ -6520,6 +6573,7 @@
             <w:pPr>
               <w:pStyle w:val="TableText"/>
               <w:spacing w:after="0"/>
+              <w:jc w:val="left"/>
             </w:pPr>
             <w:r>
               <w:rPr>
@@ -7206,6 +7260,7 @@
             <w:pPr>
               <w:pStyle w:val="TableText"/>
               <w:spacing w:after="0"/>
+              <w:jc w:val="left"/>
             </w:pPr>
             <w:r>
               <w:rPr>
@@ -7267,6 +7322,7 @@
             <w:pPr>
               <w:pStyle w:val="TableText"/>
               <w:spacing w:after="0"/>
+              <w:jc w:val="left"/>
             </w:pPr>
             <w:r>
               <w:rPr>
@@ -7316,6 +7372,7 @@
             <w:pPr>
               <w:pStyle w:val="TableText"/>
               <w:spacing w:after="0"/>
+              <w:jc w:val="left"/>
             </w:pPr>
             <w:r>
               <w:rPr>

</xml_diff>